<commit_message>
feat: add process visualization tool for AS-IS and TO-BE mapping workflows
</commit_message>
<xml_diff>
--- a/4.AS-IS (REGISTRO DE PAGOS) TO-BE.docx
+++ b/4.AS-IS (REGISTRO DE PAGOS) TO-BE.docx
@@ -256,47 +256,7 @@
                 <w:szCs w:val="24"/>
                 <w:lang w:eastAsia="es-VE"/>
               </w:rPr>
-              <w:t>Registro de Pagos (</w:t>
-            </w:r>
-            <w:proofErr w:type="spellStart"/>
-            <w:r>
-              <w:rPr>
-                <w:rFonts w:ascii="Times New Roman" w:eastAsia="Times New Roman" w:hAnsi="Times New Roman" w:cs="Times New Roman"/>
-                <w:sz w:val="24"/>
-                <w:szCs w:val="24"/>
-                <w:lang w:eastAsia="es-VE"/>
-              </w:rPr>
-              <w:t>Payment</w:t>
-            </w:r>
-            <w:proofErr w:type="spellEnd"/>
-            <w:r>
-              <w:rPr>
-                <w:rFonts w:ascii="Times New Roman" w:eastAsia="Times New Roman" w:hAnsi="Times New Roman" w:cs="Times New Roman"/>
-                <w:sz w:val="24"/>
-                <w:szCs w:val="24"/>
-                <w:lang w:eastAsia="es-VE"/>
-              </w:rPr>
-              <w:t xml:space="preserve"> </w:t>
-            </w:r>
-            <w:proofErr w:type="spellStart"/>
-            <w:r>
-              <w:rPr>
-                <w:rFonts w:ascii="Times New Roman" w:eastAsia="Times New Roman" w:hAnsi="Times New Roman" w:cs="Times New Roman"/>
-                <w:sz w:val="24"/>
-                <w:szCs w:val="24"/>
-                <w:lang w:eastAsia="es-VE"/>
-              </w:rPr>
-              <w:t>Record</w:t>
-            </w:r>
-            <w:proofErr w:type="spellEnd"/>
-            <w:r>
-              <w:rPr>
-                <w:rFonts w:ascii="Times New Roman" w:eastAsia="Times New Roman" w:hAnsi="Times New Roman" w:cs="Times New Roman"/>
-                <w:sz w:val="24"/>
-                <w:szCs w:val="24"/>
-                <w:lang w:eastAsia="es-VE"/>
-              </w:rPr>
-              <w:t xml:space="preserve">) y Conciliación Bancaria </w:t>
+              <w:t xml:space="preserve">Registro de Pagos (Payment Record) y Conciliación Bancaria </w:t>
             </w:r>
           </w:p>
         </w:tc>
@@ -638,31 +598,7 @@
           <w:szCs w:val="36"/>
           <w:lang w:eastAsia="es-VE"/>
         </w:rPr>
-        <w:t>2. Actores Involucrados (</w:t>
-      </w:r>
-      <w:proofErr w:type="spellStart"/>
-      <w:r>
-        <w:rPr>
-          <w:rFonts w:ascii="Times New Roman" w:eastAsia="Times New Roman" w:hAnsi="Times New Roman" w:cs="Times New Roman"/>
-          <w:b/>
-          <w:bCs/>
-          <w:sz w:val="36"/>
-          <w:szCs w:val="36"/>
-          <w:lang w:eastAsia="es-VE"/>
-        </w:rPr>
-        <w:t>Lanes</w:t>
-      </w:r>
-      <w:proofErr w:type="spellEnd"/>
-      <w:r>
-        <w:rPr>
-          <w:rFonts w:ascii="Times New Roman" w:eastAsia="Times New Roman" w:hAnsi="Times New Roman" w:cs="Times New Roman"/>
-          <w:b/>
-          <w:bCs/>
-          <w:sz w:val="36"/>
-          <w:szCs w:val="36"/>
-          <w:lang w:eastAsia="es-VE"/>
-        </w:rPr>
-        <w:t>)</w:t>
+        <w:t>2. Actores Involucrados (Lanes)</w:t>
       </w:r>
     </w:p>
     <w:tbl>
@@ -925,7 +861,6 @@
                 <w:lang w:eastAsia="es-VE"/>
               </w:rPr>
             </w:pPr>
-            <w:proofErr w:type="spellStart"/>
             <w:r>
               <w:rPr>
                 <w:rFonts w:ascii="Times New Roman" w:eastAsia="Times New Roman" w:hAnsi="Times New Roman" w:cs="Times New Roman"/>
@@ -935,19 +870,7 @@
                 <w:szCs w:val="24"/>
                 <w:lang w:eastAsia="es-VE"/>
               </w:rPr>
-              <w:t>vTiger</w:t>
-            </w:r>
-            <w:proofErr w:type="spellEnd"/>
-            <w:r>
-              <w:rPr>
-                <w:rFonts w:ascii="Times New Roman" w:eastAsia="Times New Roman" w:hAnsi="Times New Roman" w:cs="Times New Roman"/>
-                <w:b/>
-                <w:bCs/>
-                <w:sz w:val="24"/>
-                <w:szCs w:val="24"/>
-                <w:lang w:eastAsia="es-VE"/>
-              </w:rPr>
-              <w:t xml:space="preserve"> CRM</w:t>
+              <w:t>vTiger CRM</w:t>
             </w:r>
           </w:p>
         </w:tc>
@@ -1119,27 +1042,7 @@
                 <w:szCs w:val="24"/>
                 <w:lang w:eastAsia="es-VE"/>
               </w:rPr>
-              <w:t xml:space="preserve">Recepción del dinero (Mercantil, </w:t>
-            </w:r>
-            <w:proofErr w:type="spellStart"/>
-            <w:r>
-              <w:rPr>
-                <w:rFonts w:ascii="Times New Roman" w:eastAsia="Times New Roman" w:hAnsi="Times New Roman" w:cs="Times New Roman"/>
-                <w:sz w:val="24"/>
-                <w:szCs w:val="24"/>
-                <w:lang w:eastAsia="es-VE"/>
-              </w:rPr>
-              <w:t>Zelle</w:t>
-            </w:r>
-            <w:proofErr w:type="spellEnd"/>
-            <w:r>
-              <w:rPr>
-                <w:rFonts w:ascii="Times New Roman" w:eastAsia="Times New Roman" w:hAnsi="Times New Roman" w:cs="Times New Roman"/>
-                <w:sz w:val="24"/>
-                <w:szCs w:val="24"/>
-                <w:lang w:eastAsia="es-VE"/>
-              </w:rPr>
-              <w:t xml:space="preserve">, PayPal) </w:t>
+              <w:t xml:space="preserve">Recepción del dinero (Mercantil, Zelle, PayPal) </w:t>
             </w:r>
           </w:p>
         </w:tc>
@@ -1316,31 +1219,7 @@
                 <w:szCs w:val="24"/>
                 <w:lang w:eastAsia="es-VE"/>
               </w:rPr>
-              <w:t>Tarea / Actividad (</w:t>
-            </w:r>
-            <w:proofErr w:type="spellStart"/>
-            <w:r>
-              <w:rPr>
-                <w:rFonts w:ascii="Times New Roman" w:eastAsia="Times New Roman" w:hAnsi="Times New Roman" w:cs="Times New Roman"/>
-                <w:b/>
-                <w:bCs/>
-                <w:sz w:val="24"/>
-                <w:szCs w:val="24"/>
-                <w:lang w:eastAsia="es-VE"/>
-              </w:rPr>
-              <w:t>Task</w:t>
-            </w:r>
-            <w:proofErr w:type="spellEnd"/>
-            <w:r>
-              <w:rPr>
-                <w:rFonts w:ascii="Times New Roman" w:eastAsia="Times New Roman" w:hAnsi="Times New Roman" w:cs="Times New Roman"/>
-                <w:b/>
-                <w:bCs/>
-                <w:sz w:val="24"/>
-                <w:szCs w:val="24"/>
-                <w:lang w:eastAsia="es-VE"/>
-              </w:rPr>
-              <w:t>)</w:t>
+              <w:t>Tarea / Actividad (Task)</w:t>
             </w:r>
           </w:p>
         </w:tc>
@@ -1507,25 +1386,14 @@
                 <w:lang w:eastAsia="es-VE"/>
               </w:rPr>
             </w:pPr>
-            <w:proofErr w:type="spellStart"/>
-            <w:r>
-              <w:rPr>
-                <w:rFonts w:ascii="Times New Roman" w:eastAsia="Times New Roman" w:hAnsi="Times New Roman" w:cs="Times New Roman"/>
-                <w:sz w:val="24"/>
-                <w:szCs w:val="24"/>
-                <w:lang w:eastAsia="es-VE"/>
-              </w:rPr>
-              <w:t>vTiger</w:t>
-            </w:r>
-            <w:proofErr w:type="spellEnd"/>
-            <w:r>
-              <w:rPr>
-                <w:rFonts w:ascii="Times New Roman" w:eastAsia="Times New Roman" w:hAnsi="Times New Roman" w:cs="Times New Roman"/>
-                <w:sz w:val="24"/>
-                <w:szCs w:val="24"/>
-                <w:lang w:eastAsia="es-VE"/>
-              </w:rPr>
-              <w:t xml:space="preserve"> CRM </w:t>
+            <w:r>
+              <w:rPr>
+                <w:rFonts w:ascii="Times New Roman" w:eastAsia="Times New Roman" w:hAnsi="Times New Roman" w:cs="Times New Roman"/>
+                <w:sz w:val="24"/>
+                <w:szCs w:val="24"/>
+                <w:lang w:eastAsia="es-VE"/>
+              </w:rPr>
+              <w:t xml:space="preserve">vTiger CRM </w:t>
             </w:r>
           </w:p>
         </w:tc>
@@ -1631,47 +1499,7 @@
                 <w:szCs w:val="24"/>
                 <w:lang w:eastAsia="es-VE"/>
               </w:rPr>
-              <w:t xml:space="preserve">Ingresar al </w:t>
-            </w:r>
-            <w:proofErr w:type="spellStart"/>
-            <w:r>
-              <w:rPr>
-                <w:rFonts w:ascii="Times New Roman" w:eastAsia="Times New Roman" w:hAnsi="Times New Roman" w:cs="Times New Roman"/>
-                <w:sz w:val="24"/>
-                <w:szCs w:val="24"/>
-                <w:lang w:eastAsia="es-VE"/>
-              </w:rPr>
-              <w:t>sub-módulo</w:t>
-            </w:r>
-            <w:proofErr w:type="spellEnd"/>
-            <w:r>
-              <w:rPr>
-                <w:rFonts w:ascii="Times New Roman" w:eastAsia="Times New Roman" w:hAnsi="Times New Roman" w:cs="Times New Roman"/>
-                <w:sz w:val="24"/>
-                <w:szCs w:val="24"/>
-                <w:lang w:eastAsia="es-VE"/>
-              </w:rPr>
-              <w:t xml:space="preserve"> "</w:t>
-            </w:r>
-            <w:proofErr w:type="spellStart"/>
-            <w:r>
-              <w:rPr>
-                <w:rFonts w:ascii="Times New Roman" w:eastAsia="Times New Roman" w:hAnsi="Times New Roman" w:cs="Times New Roman"/>
-                <w:sz w:val="24"/>
-                <w:szCs w:val="24"/>
-                <w:lang w:eastAsia="es-VE"/>
-              </w:rPr>
-              <w:t>Payments</w:t>
-            </w:r>
-            <w:proofErr w:type="spellEnd"/>
-            <w:r>
-              <w:rPr>
-                <w:rFonts w:ascii="Times New Roman" w:eastAsia="Times New Roman" w:hAnsi="Times New Roman" w:cs="Times New Roman"/>
-                <w:sz w:val="24"/>
-                <w:szCs w:val="24"/>
-                <w:lang w:eastAsia="es-VE"/>
-              </w:rPr>
-              <w:t xml:space="preserve">" </w:t>
+              <w:t xml:space="preserve">Ingresar al sub-módulo "Payments" </w:t>
             </w:r>
           </w:p>
         </w:tc>
@@ -1697,25 +1525,14 @@
                 <w:lang w:eastAsia="es-VE"/>
               </w:rPr>
             </w:pPr>
-            <w:proofErr w:type="spellStart"/>
-            <w:r>
-              <w:rPr>
-                <w:rFonts w:ascii="Times New Roman" w:eastAsia="Times New Roman" w:hAnsi="Times New Roman" w:cs="Times New Roman"/>
-                <w:sz w:val="24"/>
-                <w:szCs w:val="24"/>
-                <w:lang w:eastAsia="es-VE"/>
-              </w:rPr>
-              <w:t>vTiger</w:t>
-            </w:r>
-            <w:proofErr w:type="spellEnd"/>
-            <w:r>
-              <w:rPr>
-                <w:rFonts w:ascii="Times New Roman" w:eastAsia="Times New Roman" w:hAnsi="Times New Roman" w:cs="Times New Roman"/>
-                <w:sz w:val="24"/>
-                <w:szCs w:val="24"/>
-                <w:lang w:eastAsia="es-VE"/>
-              </w:rPr>
-              <w:t xml:space="preserve"> CRM </w:t>
+            <w:r>
+              <w:rPr>
+                <w:rFonts w:ascii="Times New Roman" w:eastAsia="Times New Roman" w:hAnsi="Times New Roman" w:cs="Times New Roman"/>
+                <w:sz w:val="24"/>
+                <w:szCs w:val="24"/>
+                <w:lang w:eastAsia="es-VE"/>
+              </w:rPr>
+              <w:t xml:space="preserve">vTiger CRM </w:t>
             </w:r>
           </w:p>
         </w:tc>
@@ -1847,25 +1664,14 @@
                 <w:lang w:eastAsia="es-VE"/>
               </w:rPr>
             </w:pPr>
-            <w:proofErr w:type="spellStart"/>
-            <w:r>
-              <w:rPr>
-                <w:rFonts w:ascii="Times New Roman" w:eastAsia="Times New Roman" w:hAnsi="Times New Roman" w:cs="Times New Roman"/>
-                <w:sz w:val="24"/>
-                <w:szCs w:val="24"/>
-                <w:lang w:eastAsia="es-VE"/>
-              </w:rPr>
-              <w:t>vTiger</w:t>
-            </w:r>
-            <w:proofErr w:type="spellEnd"/>
-            <w:r>
-              <w:rPr>
-                <w:rFonts w:ascii="Times New Roman" w:eastAsia="Times New Roman" w:hAnsi="Times New Roman" w:cs="Times New Roman"/>
-                <w:sz w:val="24"/>
-                <w:szCs w:val="24"/>
-                <w:lang w:eastAsia="es-VE"/>
-              </w:rPr>
-              <w:t xml:space="preserve"> CRM </w:t>
+            <w:r>
+              <w:rPr>
+                <w:rFonts w:ascii="Times New Roman" w:eastAsia="Times New Roman" w:hAnsi="Times New Roman" w:cs="Times New Roman"/>
+                <w:sz w:val="24"/>
+                <w:szCs w:val="24"/>
+                <w:lang w:eastAsia="es-VE"/>
+              </w:rPr>
+              <w:t xml:space="preserve">vTiger CRM </w:t>
             </w:r>
           </w:p>
         </w:tc>
@@ -1971,47 +1777,7 @@
                 <w:szCs w:val="24"/>
                 <w:lang w:eastAsia="es-VE"/>
               </w:rPr>
-              <w:t>Ejecutar acción "</w:t>
-            </w:r>
-            <w:proofErr w:type="spellStart"/>
-            <w:r>
-              <w:rPr>
-                <w:rFonts w:ascii="Times New Roman" w:eastAsia="Times New Roman" w:hAnsi="Times New Roman" w:cs="Times New Roman"/>
-                <w:sz w:val="24"/>
-                <w:szCs w:val="24"/>
-                <w:lang w:eastAsia="es-VE"/>
-              </w:rPr>
-              <w:t>Record</w:t>
-            </w:r>
-            <w:proofErr w:type="spellEnd"/>
-            <w:r>
-              <w:rPr>
-                <w:rFonts w:ascii="Times New Roman" w:eastAsia="Times New Roman" w:hAnsi="Times New Roman" w:cs="Times New Roman"/>
-                <w:sz w:val="24"/>
-                <w:szCs w:val="24"/>
-                <w:lang w:eastAsia="es-VE"/>
-              </w:rPr>
-              <w:t xml:space="preserve"> </w:t>
-            </w:r>
-            <w:proofErr w:type="spellStart"/>
-            <w:r>
-              <w:rPr>
-                <w:rFonts w:ascii="Times New Roman" w:eastAsia="Times New Roman" w:hAnsi="Times New Roman" w:cs="Times New Roman"/>
-                <w:sz w:val="24"/>
-                <w:szCs w:val="24"/>
-                <w:lang w:eastAsia="es-VE"/>
-              </w:rPr>
-              <w:t>Payment</w:t>
-            </w:r>
-            <w:proofErr w:type="spellEnd"/>
-            <w:r>
-              <w:rPr>
-                <w:rFonts w:ascii="Times New Roman" w:eastAsia="Times New Roman" w:hAnsi="Times New Roman" w:cs="Times New Roman"/>
-                <w:sz w:val="24"/>
-                <w:szCs w:val="24"/>
-                <w:lang w:eastAsia="es-VE"/>
-              </w:rPr>
-              <w:t xml:space="preserve">" </w:t>
+              <w:t xml:space="preserve">Ejecutar acción "Record Payment" </w:t>
             </w:r>
           </w:p>
         </w:tc>
@@ -2037,25 +1803,14 @@
                 <w:lang w:eastAsia="es-VE"/>
               </w:rPr>
             </w:pPr>
-            <w:proofErr w:type="spellStart"/>
-            <w:r>
-              <w:rPr>
-                <w:rFonts w:ascii="Times New Roman" w:eastAsia="Times New Roman" w:hAnsi="Times New Roman" w:cs="Times New Roman"/>
-                <w:sz w:val="24"/>
-                <w:szCs w:val="24"/>
-                <w:lang w:eastAsia="es-VE"/>
-              </w:rPr>
-              <w:t>vTiger</w:t>
-            </w:r>
-            <w:proofErr w:type="spellEnd"/>
-            <w:r>
-              <w:rPr>
-                <w:rFonts w:ascii="Times New Roman" w:eastAsia="Times New Roman" w:hAnsi="Times New Roman" w:cs="Times New Roman"/>
-                <w:sz w:val="24"/>
-                <w:szCs w:val="24"/>
-                <w:lang w:eastAsia="es-VE"/>
-              </w:rPr>
-              <w:t xml:space="preserve"> CRM </w:t>
+            <w:r>
+              <w:rPr>
+                <w:rFonts w:ascii="Times New Roman" w:eastAsia="Times New Roman" w:hAnsi="Times New Roman" w:cs="Times New Roman"/>
+                <w:sz w:val="24"/>
+                <w:szCs w:val="24"/>
+                <w:lang w:eastAsia="es-VE"/>
+              </w:rPr>
+              <w:t xml:space="preserve">vTiger CRM </w:t>
             </w:r>
           </w:p>
         </w:tc>
@@ -2187,25 +1942,14 @@
                 <w:lang w:eastAsia="es-VE"/>
               </w:rPr>
             </w:pPr>
-            <w:proofErr w:type="spellStart"/>
-            <w:r>
-              <w:rPr>
-                <w:rFonts w:ascii="Times New Roman" w:eastAsia="Times New Roman" w:hAnsi="Times New Roman" w:cs="Times New Roman"/>
-                <w:sz w:val="24"/>
-                <w:szCs w:val="24"/>
-                <w:lang w:eastAsia="es-VE"/>
-              </w:rPr>
-              <w:t>vTiger</w:t>
-            </w:r>
-            <w:proofErr w:type="spellEnd"/>
-            <w:r>
-              <w:rPr>
-                <w:rFonts w:ascii="Times New Roman" w:eastAsia="Times New Roman" w:hAnsi="Times New Roman" w:cs="Times New Roman"/>
-                <w:sz w:val="24"/>
-                <w:szCs w:val="24"/>
-                <w:lang w:eastAsia="es-VE"/>
-              </w:rPr>
-              <w:t xml:space="preserve"> CRM </w:t>
+            <w:r>
+              <w:rPr>
+                <w:rFonts w:ascii="Times New Roman" w:eastAsia="Times New Roman" w:hAnsi="Times New Roman" w:cs="Times New Roman"/>
+                <w:sz w:val="24"/>
+                <w:szCs w:val="24"/>
+                <w:lang w:eastAsia="es-VE"/>
+              </w:rPr>
+              <w:t xml:space="preserve">vTiger CRM </w:t>
             </w:r>
           </w:p>
         </w:tc>
@@ -2344,27 +2088,7 @@
                 <w:szCs w:val="24"/>
                 <w:lang w:eastAsia="es-VE"/>
               </w:rPr>
-              <w:t xml:space="preserve">Email / </w:t>
-            </w:r>
-            <w:proofErr w:type="spellStart"/>
-            <w:r>
-              <w:rPr>
-                <w:rFonts w:ascii="Times New Roman" w:eastAsia="Times New Roman" w:hAnsi="Times New Roman" w:cs="Times New Roman"/>
-                <w:sz w:val="24"/>
-                <w:szCs w:val="24"/>
-                <w:lang w:eastAsia="es-VE"/>
-              </w:rPr>
-              <w:t>vTiger</w:t>
-            </w:r>
-            <w:proofErr w:type="spellEnd"/>
-            <w:r>
-              <w:rPr>
-                <w:rFonts w:ascii="Times New Roman" w:eastAsia="Times New Roman" w:hAnsi="Times New Roman" w:cs="Times New Roman"/>
-                <w:sz w:val="24"/>
-                <w:szCs w:val="24"/>
-                <w:lang w:eastAsia="es-VE"/>
-              </w:rPr>
-              <w:t xml:space="preserve"> PDF </w:t>
+              <w:t xml:space="preserve">Email / vTiger PDF </w:t>
             </w:r>
           </w:p>
         </w:tc>
@@ -2470,47 +2194,7 @@
                 <w:szCs w:val="24"/>
                 <w:lang w:eastAsia="es-VE"/>
               </w:rPr>
-              <w:t xml:space="preserve">Actualizar estatus del </w:t>
-            </w:r>
-            <w:proofErr w:type="spellStart"/>
-            <w:r>
-              <w:rPr>
-                <w:rFonts w:ascii="Times New Roman" w:eastAsia="Times New Roman" w:hAnsi="Times New Roman" w:cs="Times New Roman"/>
-                <w:sz w:val="24"/>
-                <w:szCs w:val="24"/>
-                <w:lang w:eastAsia="es-VE"/>
-              </w:rPr>
-              <w:t>Payment</w:t>
-            </w:r>
-            <w:proofErr w:type="spellEnd"/>
-            <w:r>
-              <w:rPr>
-                <w:rFonts w:ascii="Times New Roman" w:eastAsia="Times New Roman" w:hAnsi="Times New Roman" w:cs="Times New Roman"/>
-                <w:sz w:val="24"/>
-                <w:szCs w:val="24"/>
-                <w:lang w:eastAsia="es-VE"/>
-              </w:rPr>
-              <w:t xml:space="preserve"> </w:t>
-            </w:r>
-            <w:proofErr w:type="spellStart"/>
-            <w:r>
-              <w:rPr>
-                <w:rFonts w:ascii="Times New Roman" w:eastAsia="Times New Roman" w:hAnsi="Times New Roman" w:cs="Times New Roman"/>
-                <w:sz w:val="24"/>
-                <w:szCs w:val="24"/>
-                <w:lang w:eastAsia="es-VE"/>
-              </w:rPr>
-              <w:t>Record</w:t>
-            </w:r>
-            <w:proofErr w:type="spellEnd"/>
-            <w:r>
-              <w:rPr>
-                <w:rFonts w:ascii="Times New Roman" w:eastAsia="Times New Roman" w:hAnsi="Times New Roman" w:cs="Times New Roman"/>
-                <w:sz w:val="24"/>
-                <w:szCs w:val="24"/>
-                <w:lang w:eastAsia="es-VE"/>
-              </w:rPr>
-              <w:t xml:space="preserve"> original a "Procesado" </w:t>
+              <w:t xml:space="preserve">Actualizar estatus del Payment Record original a "Procesado" </w:t>
             </w:r>
           </w:p>
         </w:tc>
@@ -2536,25 +2220,14 @@
                 <w:lang w:eastAsia="es-VE"/>
               </w:rPr>
             </w:pPr>
-            <w:proofErr w:type="spellStart"/>
-            <w:r>
-              <w:rPr>
-                <w:rFonts w:ascii="Times New Roman" w:eastAsia="Times New Roman" w:hAnsi="Times New Roman" w:cs="Times New Roman"/>
-                <w:sz w:val="24"/>
-                <w:szCs w:val="24"/>
-                <w:lang w:eastAsia="es-VE"/>
-              </w:rPr>
-              <w:t>vTiger</w:t>
-            </w:r>
-            <w:proofErr w:type="spellEnd"/>
-            <w:r>
-              <w:rPr>
-                <w:rFonts w:ascii="Times New Roman" w:eastAsia="Times New Roman" w:hAnsi="Times New Roman" w:cs="Times New Roman"/>
-                <w:sz w:val="24"/>
-                <w:szCs w:val="24"/>
-                <w:lang w:eastAsia="es-VE"/>
-              </w:rPr>
-              <w:t xml:space="preserve"> CRM </w:t>
+            <w:r>
+              <w:rPr>
+                <w:rFonts w:ascii="Times New Roman" w:eastAsia="Times New Roman" w:hAnsi="Times New Roman" w:cs="Times New Roman"/>
+                <w:sz w:val="24"/>
+                <w:szCs w:val="24"/>
+                <w:lang w:eastAsia="es-VE"/>
+              </w:rPr>
+              <w:t xml:space="preserve">vTiger CRM </w:t>
             </w:r>
           </w:p>
         </w:tc>
@@ -2604,31 +2277,7 @@
           <w:szCs w:val="36"/>
           <w:lang w:eastAsia="es-VE"/>
         </w:rPr>
-        <w:t>4. Reglas de Negocio y Puertas de Enlace (</w:t>
-      </w:r>
-      <w:proofErr w:type="spellStart"/>
-      <w:r>
-        <w:rPr>
-          <w:rFonts w:ascii="Times New Roman" w:eastAsia="Times New Roman" w:hAnsi="Times New Roman" w:cs="Times New Roman"/>
-          <w:b/>
-          <w:bCs/>
-          <w:sz w:val="36"/>
-          <w:szCs w:val="36"/>
-          <w:lang w:eastAsia="es-VE"/>
-        </w:rPr>
-        <w:t>Gateways</w:t>
-      </w:r>
-      <w:proofErr w:type="spellEnd"/>
-      <w:r>
-        <w:rPr>
-          <w:rFonts w:ascii="Times New Roman" w:eastAsia="Times New Roman" w:hAnsi="Times New Roman" w:cs="Times New Roman"/>
-          <w:b/>
-          <w:bCs/>
-          <w:sz w:val="36"/>
-          <w:szCs w:val="36"/>
-          <w:lang w:eastAsia="es-VE"/>
-        </w:rPr>
-        <w:t>)</w:t>
+        <w:t>4. Reglas de Negocio y Puertas de Enlace (Gateways)</w:t>
       </w:r>
     </w:p>
     <w:p>
@@ -2768,31 +2417,7 @@
           <w:szCs w:val="24"/>
           <w:lang w:eastAsia="es-VE"/>
         </w:rPr>
-        <w:t>"</w:t>
-      </w:r>
-      <w:proofErr w:type="spellStart"/>
-      <w:r>
-        <w:rPr>
-          <w:rFonts w:ascii="Times New Roman" w:eastAsia="Times New Roman" w:hAnsi="Times New Roman" w:cs="Times New Roman"/>
-          <w:b/>
-          <w:bCs/>
-          <w:sz w:val="24"/>
-          <w:szCs w:val="24"/>
-          <w:lang w:eastAsia="es-VE"/>
-        </w:rPr>
-        <w:t>Paid</w:t>
-      </w:r>
-      <w:proofErr w:type="spellEnd"/>
-      <w:r>
-        <w:rPr>
-          <w:rFonts w:ascii="Times New Roman" w:eastAsia="Times New Roman" w:hAnsi="Times New Roman" w:cs="Times New Roman"/>
-          <w:b/>
-          <w:bCs/>
-          <w:sz w:val="24"/>
-          <w:szCs w:val="24"/>
-          <w:lang w:eastAsia="es-VE"/>
-        </w:rPr>
-        <w:t>" (Pagado)</w:t>
+        <w:t>"Paid" (Pagado)</w:t>
       </w:r>
       <w:r>
         <w:rPr>
@@ -3030,47 +2655,7 @@
           <w:szCs w:val="24"/>
           <w:lang w:eastAsia="es-VE"/>
         </w:rPr>
-        <w:t xml:space="preserve"> La transcripción manual de montos y números de referencia de </w:t>
-      </w:r>
-      <w:proofErr w:type="spellStart"/>
-      <w:r>
-        <w:rPr>
-          <w:rFonts w:ascii="Times New Roman" w:eastAsia="Times New Roman" w:hAnsi="Times New Roman" w:cs="Times New Roman"/>
-          <w:sz w:val="24"/>
-          <w:szCs w:val="24"/>
-          <w:lang w:eastAsia="es-VE"/>
-        </w:rPr>
-        <w:t>Zelle</w:t>
-      </w:r>
-      <w:proofErr w:type="spellEnd"/>
-      <w:r>
-        <w:rPr>
-          <w:rFonts w:ascii="Times New Roman" w:eastAsia="Times New Roman" w:hAnsi="Times New Roman" w:cs="Times New Roman"/>
-          <w:sz w:val="24"/>
-          <w:szCs w:val="24"/>
-          <w:lang w:eastAsia="es-VE"/>
-        </w:rPr>
-        <w:t xml:space="preserve">/Mercantil a </w:t>
-      </w:r>
-      <w:proofErr w:type="spellStart"/>
-      <w:r>
-        <w:rPr>
-          <w:rFonts w:ascii="Times New Roman" w:eastAsia="Times New Roman" w:hAnsi="Times New Roman" w:cs="Times New Roman"/>
-          <w:sz w:val="24"/>
-          <w:szCs w:val="24"/>
-          <w:lang w:eastAsia="es-VE"/>
-        </w:rPr>
-        <w:t>vTiger</w:t>
-      </w:r>
-      <w:proofErr w:type="spellEnd"/>
-      <w:r>
-        <w:rPr>
-          <w:rFonts w:ascii="Times New Roman" w:eastAsia="Times New Roman" w:hAnsi="Times New Roman" w:cs="Times New Roman"/>
-          <w:sz w:val="24"/>
-          <w:szCs w:val="24"/>
-          <w:lang w:eastAsia="es-VE"/>
-        </w:rPr>
-        <w:t xml:space="preserve"> es propensa a errores humanos. </w:t>
+        <w:t xml:space="preserve"> La transcripción manual de montos y números de referencia de Zelle/Mercantil a vTiger es propensa a errores humanos. </w:t>
       </w:r>
     </w:p>
     <w:p>
@@ -3142,7 +2727,6 @@
         </w:rPr>
         <w:t xml:space="preserve"> La necesidad de hacer clic en "Macros &gt; Run" de forma manual podría automatizarse mediante </w:t>
       </w:r>
-      <w:proofErr w:type="spellStart"/>
       <w:r>
         <w:rPr>
           <w:rFonts w:ascii="Times New Roman" w:eastAsia="Times New Roman" w:hAnsi="Times New Roman" w:cs="Times New Roman"/>
@@ -3154,7 +2738,6 @@
         </w:rPr>
         <w:t>Workflows</w:t>
       </w:r>
-      <w:proofErr w:type="spellEnd"/>
       <w:r>
         <w:rPr>
           <w:rFonts w:ascii="Times New Roman" w:eastAsia="Times New Roman" w:hAnsi="Times New Roman" w:cs="Times New Roman"/>
@@ -3197,50 +2780,87 @@
           <w:szCs w:val="24"/>
           <w:lang w:eastAsia="es-VE"/>
         </w:rPr>
-        <w:t xml:space="preserve"> El proceso de quitar el "</w:t>
-      </w:r>
-      <w:proofErr w:type="spellStart"/>
-      <w:r>
+        <w:t xml:space="preserve"> El proceso de quitar el "check de firma" y seleccionar el correo del cliente es un paso repetitivo que podría preconfigurarse en una plantilla de correo dinámica. </w:t>
+      </w:r>
+    </w:p>
+    <w:p>
+      <w:pPr>
+        <w:spacing w:before="100" w:beforeAutospacing="1" w:after="100" w:afterAutospacing="1" w:line="240" w:lineRule="auto"/>
         <w:rPr>
           <w:rFonts w:ascii="Times New Roman" w:eastAsia="Times New Roman" w:hAnsi="Times New Roman" w:cs="Times New Roman"/>
           <w:sz w:val="24"/>
           <w:szCs w:val="24"/>
           <w:lang w:eastAsia="es-VE"/>
         </w:rPr>
-        <w:t>check</w:t>
-      </w:r>
-      <w:proofErr w:type="spellEnd"/>
-      <w:r>
+      </w:pPr>
+    </w:p>
+    <w:p>
+      <w:pPr>
+        <w:spacing w:before="100" w:beforeAutospacing="1" w:after="100" w:afterAutospacing="1" w:line="240" w:lineRule="auto"/>
         <w:rPr>
           <w:rFonts w:ascii="Times New Roman" w:eastAsia="Times New Roman" w:hAnsi="Times New Roman" w:cs="Times New Roman"/>
           <w:sz w:val="24"/>
           <w:szCs w:val="24"/>
           <w:lang w:eastAsia="es-VE"/>
         </w:rPr>
-        <w:t xml:space="preserve"> de firma" y seleccionar el correo del cliente es un paso repetitivo que podría preconfigurarse en una plantilla de correo dinámica. </w:t>
-      </w:r>
-    </w:p>
-    <w:p>
-      <w:pPr>
-        <w:spacing w:before="100" w:beforeAutospacing="1" w:after="100" w:afterAutospacing="1" w:line="240" w:lineRule="auto"/>
-        <w:rPr>
-          <w:rFonts w:ascii="Times New Roman" w:eastAsia="Times New Roman" w:hAnsi="Times New Roman" w:cs="Times New Roman"/>
+      </w:pPr>
+      <w:r>
+        <w:rPr>
+          <w:rFonts w:ascii="Times New Roman" w:eastAsia="Times New Roman" w:hAnsi="Times New Roman" w:cs="Times New Roman"/>
+          <w:noProof/>
           <w:sz w:val="24"/>
           <w:szCs w:val="24"/>
           <w:lang w:eastAsia="es-VE"/>
         </w:rPr>
-      </w:pPr>
-    </w:p>
-    <w:p>
-      <w:pPr>
-        <w:spacing w:before="100" w:beforeAutospacing="1" w:after="100" w:afterAutospacing="1" w:line="240" w:lineRule="auto"/>
-        <w:rPr>
-          <w:rFonts w:ascii="Times New Roman" w:eastAsia="Times New Roman" w:hAnsi="Times New Roman" w:cs="Times New Roman"/>
-          <w:sz w:val="24"/>
-          <w:szCs w:val="24"/>
-          <w:lang w:eastAsia="es-VE"/>
-        </w:rPr>
-      </w:pPr>
+        <w:drawing>
+          <wp:inline distT="0" distB="0" distL="0" distR="0" wp14:anchorId="768E862B" wp14:editId="267DF8BC">
+            <wp:extent cx="16007715" cy="3467735"/>
+            <wp:effectExtent l="0" t="0" r="0" b="0"/>
+            <wp:docPr id="1" name="Imagen 1"/>
+            <wp:cNvGraphicFramePr>
+              <a:graphicFrameLocks xmlns:a="http://schemas.openxmlformats.org/drawingml/2006/main" noChangeAspect="1"/>
+            </wp:cNvGraphicFramePr>
+            <a:graphic xmlns:a="http://schemas.openxmlformats.org/drawingml/2006/main">
+              <a:graphicData uri="http://schemas.openxmlformats.org/drawingml/2006/picture">
+                <pic:pic xmlns:pic="http://schemas.openxmlformats.org/drawingml/2006/picture">
+                  <pic:nvPicPr>
+                    <pic:cNvPr id="0" name="Picture 10"/>
+                    <pic:cNvPicPr>
+                      <a:picLocks noChangeAspect="1" noChangeArrowheads="1"/>
+                    </pic:cNvPicPr>
+                  </pic:nvPicPr>
+                  <pic:blipFill>
+                    <a:blip r:embed="rId5" cstate="print">
+                      <a:extLst>
+                        <a:ext uri="{28A0092B-C50C-407E-A947-70E740481C1C}">
+                          <a14:useLocalDpi xmlns:a14="http://schemas.microsoft.com/office/drawing/2010/main" val="0"/>
+                        </a:ext>
+                      </a:extLst>
+                    </a:blip>
+                    <a:srcRect/>
+                    <a:stretch>
+                      <a:fillRect/>
+                    </a:stretch>
+                  </pic:blipFill>
+                  <pic:spPr bwMode="auto">
+                    <a:xfrm>
+                      <a:off x="0" y="0"/>
+                      <a:ext cx="16007715" cy="3467735"/>
+                    </a:xfrm>
+                    <a:prstGeom prst="rect">
+                      <a:avLst/>
+                    </a:prstGeom>
+                    <a:noFill/>
+                    <a:ln>
+                      <a:noFill/>
+                    </a:ln>
+                  </pic:spPr>
+                </pic:pic>
+              </a:graphicData>
+            </a:graphic>
+          </wp:inline>
+        </w:drawing>
+      </w:r>
     </w:p>
     <w:p>
       <w:pPr>
@@ -3404,13 +3024,8 @@
               <w:spacing w:after="480"/>
             </w:pPr>
             <w:r>
-              <w:t xml:space="preserve">Gestión Automatizada de Pagos y Conciliación </w:t>
-            </w:r>
-            <w:proofErr w:type="spellStart"/>
-            <w:r>
-              <w:t>vTiger</w:t>
-            </w:r>
-            <w:proofErr w:type="spellEnd"/>
+              <w:t>Gestión Automatizada de Pagos y Conciliación vTiger</w:t>
+            </w:r>
           </w:p>
         </w:tc>
       </w:tr>
@@ -3616,15 +3231,7 @@
         <w:pStyle w:val="Ttulo3"/>
       </w:pPr>
       <w:r>
-        <w:t>2. Actores Involucrados (</w:t>
-      </w:r>
-      <w:proofErr w:type="spellStart"/>
-      <w:r>
-        <w:t>Lanes</w:t>
-      </w:r>
-      <w:proofErr w:type="spellEnd"/>
-      <w:r>
-        <w:t>)</w:t>
+        <w:t>2. Actores Involucrados (Lanes)</w:t>
       </w:r>
     </w:p>
     <w:p>
@@ -3667,34 +3274,10 @@
           <w:b/>
           <w:bCs/>
         </w:rPr>
-        <w:t xml:space="preserve">Sistema </w:t>
-      </w:r>
-      <w:proofErr w:type="spellStart"/>
-      <w:r>
-        <w:rPr>
-          <w:b/>
-          <w:bCs/>
-        </w:rPr>
-        <w:t>vTiger</w:t>
-      </w:r>
-      <w:proofErr w:type="spellEnd"/>
-      <w:r>
-        <w:rPr>
-          <w:b/>
-          <w:bCs/>
-        </w:rPr>
-        <w:t xml:space="preserve"> (BPMS/Core):</w:t>
-      </w:r>
-      <w:r>
-        <w:t xml:space="preserve"> Ejecuta flujos de trabajo (</w:t>
-      </w:r>
-      <w:proofErr w:type="spellStart"/>
-      <w:r>
-        <w:t>Workflows</w:t>
-      </w:r>
-      <w:proofErr w:type="spellEnd"/>
-      <w:r>
-        <w:t xml:space="preserve">) automáticos tras cambios de estado. </w:t>
+        <w:t>Sistema vTiger (BPMS/Core):</w:t>
+      </w:r>
+      <w:r>
+        <w:t xml:space="preserve"> Ejecuta flujos de trabajo (Workflows) automáticos tras cambios de estado. </w:t>
       </w:r>
     </w:p>
     <w:p>
@@ -3938,19 +3521,9 @@
             <w:pPr>
               <w:spacing w:after="480"/>
             </w:pPr>
-            <w:proofErr w:type="spellStart"/>
-            <w:r>
-              <w:t>User</w:t>
-            </w:r>
-            <w:proofErr w:type="spellEnd"/>
-            <w:r>
-              <w:t xml:space="preserve"> </w:t>
-            </w:r>
-            <w:proofErr w:type="spellStart"/>
-            <w:r>
-              <w:t>Task</w:t>
-            </w:r>
-            <w:proofErr w:type="spellEnd"/>
+            <w:r>
+              <w:t>User Task</w:t>
+            </w:r>
           </w:p>
         </w:tc>
       </w:tr>
@@ -4041,31 +3614,13 @@
             <w:pPr>
               <w:spacing w:after="480"/>
             </w:pPr>
-            <w:proofErr w:type="spellStart"/>
             <w:r>
               <w:rPr>
                 <w:b/>
                 <w:bCs/>
               </w:rPr>
-              <w:t>Service</w:t>
-            </w:r>
-            <w:proofErr w:type="spellEnd"/>
-            <w:r>
-              <w:rPr>
-                <w:b/>
-                <w:bCs/>
-              </w:rPr>
-              <w:t xml:space="preserve"> </w:t>
-            </w:r>
-            <w:proofErr w:type="spellStart"/>
-            <w:r>
-              <w:rPr>
-                <w:b/>
-                <w:bCs/>
-              </w:rPr>
-              <w:t>Task</w:t>
-            </w:r>
-            <w:proofErr w:type="spellEnd"/>
+              <w:t>Service Task</w:t>
+            </w:r>
           </w:p>
         </w:tc>
       </w:tr>
@@ -4229,23 +3784,7 @@
               <w:spacing w:after="480"/>
             </w:pPr>
             <w:r>
-              <w:t>Crear "</w:t>
-            </w:r>
-            <w:proofErr w:type="spellStart"/>
-            <w:r>
-              <w:t>Payment</w:t>
-            </w:r>
-            <w:proofErr w:type="spellEnd"/>
-            <w:r>
-              <w:t xml:space="preserve"> </w:t>
-            </w:r>
-            <w:proofErr w:type="spellStart"/>
-            <w:r>
-              <w:t>Record</w:t>
-            </w:r>
-            <w:proofErr w:type="spellEnd"/>
-            <w:r>
-              <w:t>" y vincular a Factura</w:t>
+              <w:t>Crear "Payment Record" y vincular a Factura</w:t>
             </w:r>
           </w:p>
         </w:tc>
@@ -4265,31 +3804,13 @@
             <w:pPr>
               <w:spacing w:after="480"/>
             </w:pPr>
-            <w:proofErr w:type="spellStart"/>
             <w:r>
               <w:rPr>
                 <w:b/>
                 <w:bCs/>
               </w:rPr>
-              <w:t>Service</w:t>
-            </w:r>
-            <w:proofErr w:type="spellEnd"/>
-            <w:r>
-              <w:rPr>
-                <w:b/>
-                <w:bCs/>
-              </w:rPr>
-              <w:t xml:space="preserve"> </w:t>
-            </w:r>
-            <w:proofErr w:type="spellStart"/>
-            <w:r>
-              <w:rPr>
-                <w:b/>
-                <w:bCs/>
-              </w:rPr>
-              <w:t>Task</w:t>
-            </w:r>
-            <w:proofErr w:type="spellEnd"/>
+              <w:t>Service Task</w:t>
+            </w:r>
           </w:p>
         </w:tc>
       </w:tr>
@@ -4385,17 +3906,8 @@
                 <w:b/>
                 <w:bCs/>
               </w:rPr>
-              <w:t xml:space="preserve">Script </w:t>
-            </w:r>
-            <w:proofErr w:type="spellStart"/>
-            <w:r>
-              <w:rPr>
-                <w:b/>
-                <w:bCs/>
-              </w:rPr>
-              <w:t>Task</w:t>
-            </w:r>
-            <w:proofErr w:type="spellEnd"/>
+              <w:t>Script Task</w:t>
+            </w:r>
           </w:p>
         </w:tc>
       </w:tr>
@@ -4486,31 +3998,13 @@
             <w:pPr>
               <w:spacing w:after="480"/>
             </w:pPr>
-            <w:proofErr w:type="spellStart"/>
             <w:r>
               <w:rPr>
                 <w:b/>
                 <w:bCs/>
               </w:rPr>
-              <w:t>Service</w:t>
-            </w:r>
-            <w:proofErr w:type="spellEnd"/>
-            <w:r>
-              <w:rPr>
-                <w:b/>
-                <w:bCs/>
-              </w:rPr>
-              <w:t xml:space="preserve"> </w:t>
-            </w:r>
-            <w:proofErr w:type="spellStart"/>
-            <w:r>
-              <w:rPr>
-                <w:b/>
-                <w:bCs/>
-              </w:rPr>
-              <w:t>Task</w:t>
-            </w:r>
-            <w:proofErr w:type="spellEnd"/>
+              <w:t>Service Task</w:t>
+            </w:r>
           </w:p>
         </w:tc>
       </w:tr>
@@ -4601,31 +4095,13 @@
             <w:pPr>
               <w:spacing w:after="480"/>
             </w:pPr>
-            <w:proofErr w:type="spellStart"/>
             <w:r>
               <w:rPr>
                 <w:b/>
                 <w:bCs/>
               </w:rPr>
-              <w:t>Service</w:t>
-            </w:r>
-            <w:proofErr w:type="spellEnd"/>
-            <w:r>
-              <w:rPr>
-                <w:b/>
-                <w:bCs/>
-              </w:rPr>
-              <w:t xml:space="preserve"> </w:t>
-            </w:r>
-            <w:proofErr w:type="spellStart"/>
-            <w:r>
-              <w:rPr>
-                <w:b/>
-                <w:bCs/>
-              </w:rPr>
-              <w:t>Task</w:t>
-            </w:r>
-            <w:proofErr w:type="spellEnd"/>
+              <w:t>Service Task</w:t>
+            </w:r>
           </w:p>
         </w:tc>
       </w:tr>
@@ -4645,15 +4121,7 @@
         <w:pStyle w:val="Ttulo3"/>
       </w:pPr>
       <w:r>
-        <w:t>4. Reglas de Negocio y Puertas de Enlace (</w:t>
-      </w:r>
-      <w:proofErr w:type="spellStart"/>
-      <w:r>
-        <w:t>Gateways</w:t>
-      </w:r>
-      <w:proofErr w:type="spellEnd"/>
-      <w:r>
-        <w:t>)</w:t>
+        <w:t>4. Reglas de Negocio y Puertas de Enlace (Gateways)</w:t>
       </w:r>
     </w:p>
     <w:p>
@@ -4684,15 +4152,7 @@
         <w:t>Camino "SÍ":</w:t>
       </w:r>
       <w:r>
-        <w:t xml:space="preserve"> Si el monto y la referencia coinciden con los datos bancarios, el sistema </w:t>
-      </w:r>
-      <w:proofErr w:type="spellStart"/>
-      <w:r>
-        <w:t>auto-procesa</w:t>
-      </w:r>
-      <w:proofErr w:type="spellEnd"/>
-      <w:r>
-        <w:t xml:space="preserve"> el pago sin intervención humana. </w:t>
+        <w:t xml:space="preserve"> Si el monto y la referencia coinciden con los datos bancarios, el sistema auto-procesa el pago sin intervención humana. </w:t>
       </w:r>
     </w:p>
     <w:p>
@@ -4793,15 +4253,60 @@
         <w:t>Eficiencia en Comunicación:</w:t>
       </w:r>
       <w:r>
-        <w:t xml:space="preserve"> El envío de la factura con firma digital integrada se convierte en una tarea de fondo (</w:t>
-      </w:r>
-      <w:proofErr w:type="spellStart"/>
-      <w:r>
-        <w:t>background</w:t>
-      </w:r>
-      <w:proofErr w:type="spellEnd"/>
-      <w:r>
-        <w:t xml:space="preserve">), liberando tiempo del operador. </w:t>
+        <w:t xml:space="preserve"> El envío de la factura con firma digital integrada se convierte en una tarea de fondo (background), liberando tiempo del operador. </w:t>
+      </w:r>
+      <w:r>
+        <w:rPr>
+          <w:noProof/>
+        </w:rPr>
+        <w:drawing>
+          <wp:inline distT="0" distB="0" distL="0" distR="0" wp14:anchorId="744361E0" wp14:editId="577E10BD">
+            <wp:extent cx="13264515" cy="3467735"/>
+            <wp:effectExtent l="0" t="0" r="0" b="0"/>
+            <wp:docPr id="2" name="Imagen 2"/>
+            <wp:cNvGraphicFramePr>
+              <a:graphicFrameLocks xmlns:a="http://schemas.openxmlformats.org/drawingml/2006/main" noChangeAspect="1"/>
+            </wp:cNvGraphicFramePr>
+            <a:graphic xmlns:a="http://schemas.openxmlformats.org/drawingml/2006/main">
+              <a:graphicData uri="http://schemas.openxmlformats.org/drawingml/2006/picture">
+                <pic:pic xmlns:pic="http://schemas.openxmlformats.org/drawingml/2006/picture">
+                  <pic:nvPicPr>
+                    <pic:cNvPr id="0" name="Picture 11"/>
+                    <pic:cNvPicPr>
+                      <a:picLocks noChangeAspect="1" noChangeArrowheads="1"/>
+                    </pic:cNvPicPr>
+                  </pic:nvPicPr>
+                  <pic:blipFill>
+                    <a:blip r:embed="rId6" cstate="print">
+                      <a:extLst>
+                        <a:ext uri="{28A0092B-C50C-407E-A947-70E740481C1C}">
+                          <a14:useLocalDpi xmlns:a14="http://schemas.microsoft.com/office/drawing/2010/main" val="0"/>
+                        </a:ext>
+                      </a:extLst>
+                    </a:blip>
+                    <a:srcRect/>
+                    <a:stretch>
+                      <a:fillRect/>
+                    </a:stretch>
+                  </pic:blipFill>
+                  <pic:spPr bwMode="auto">
+                    <a:xfrm>
+                      <a:off x="0" y="0"/>
+                      <a:ext cx="13264515" cy="3467735"/>
+                    </a:xfrm>
+                    <a:prstGeom prst="rect">
+                      <a:avLst/>
+                    </a:prstGeom>
+                    <a:noFill/>
+                    <a:ln>
+                      <a:noFill/>
+                    </a:ln>
+                  </pic:spPr>
+                </pic:pic>
+              </a:graphicData>
+            </a:graphic>
+          </wp:inline>
+        </w:drawing>
       </w:r>
     </w:p>
     <w:p>

</xml_diff>